<commit_message>
Attach applicant passport on page 2 of DOCX and PDF templates
</commit_message>
<xml_diff>
--- a/template/cv_template.docx
+++ b/template/cv_template.docx
@@ -14276,16 +14276,57 @@
     </w:p>
     <w:p>
       <w:pPr>
+        <w:spacing w:before="0" w:after="160"/>
+        <w:jc w:val="center"/>
         <w:rPr>
           <w:rFonts w:ascii="Times New Roman"/>
           <w:sz w:val="28"/>
           <w:szCs w:val="32"/>
         </w:rPr>
       </w:pPr>
+      <w:r/>
+      <w:r>
+        <w:rPr>
+          <w:rFonts w:ascii="Arial" w:hAnsi="Arial" w:cs="Arial"/>
+          <w:sz w:val="16"/>
+          <w:szCs w:val="16"/>
+          <w:color w:val="000000"/>
+        </w:rPr>
+        <w:t xml:space="preserve">{% if photo_passport %}</w:t>
+      </w:r>
+      <w:r>
+        <w:rPr>
+          <w:rFonts w:ascii="Arial" w:hAnsi="Arial" w:cs="Arial"/>
+          <w:b/>
+          <w:sz w:val="28"/>
+          <w:szCs w:val="28"/>
+          <w:color w:val="1B365D"/>
+        </w:rPr>
+        <w:t xml:space="preserve">PASSPORT
+</w:t>
+      </w:r>
+      <w:r>
+        <w:rPr>
+          <w:rFonts w:ascii="Arial" w:hAnsi="Arial" w:cs="Arial"/>
+          <w:sz w:val="20"/>
+          <w:szCs w:val="20"/>
+          <w:color w:val="000000"/>
+        </w:rPr>
+        <w:t xml:space="preserve">{{ photo_passport }}</w:t>
+      </w:r>
+      <w:r>
+        <w:rPr>
+          <w:rFonts w:ascii="Arial" w:hAnsi="Arial" w:cs="Arial"/>
+          <w:sz w:val="16"/>
+          <w:szCs w:val="16"/>
+          <w:color w:val="000000"/>
+        </w:rPr>
+        <w:t xml:space="preserve">{% endif %}</w:t>
+      </w:r>
     </w:p>
     <w:sectPr>
       <w:pgSz w:w="11910" w:h="16840"/>
-      <w:pgMar w:top="40" w:right="0" w:bottom="280" w:left="0" w:header="720" w:footer="720" w:gutter="0"/>
+      <w:pgMar w:top="720" w:right="720" w:bottom="720" w:left="720" w:header="720" w:footer="720" w:gutter="0"/>
       <w:cols w:space="720"/>
     </w:sectPr>
   </w:body>

</xml_diff>

<commit_message>
Fix logo rendering on cloud, eliminate blank middle PDF page, and adjust full-body photo frame
</commit_message>
<xml_diff>
--- a/template/cv_template.docx
+++ b/template/cv_template.docx
@@ -155,12 +155,22 @@
                                 <w:p>
                                   <w:pPr>
                                     <w:pStyle w:val="TableParagraph"/>
+                                    <w:jc w:val="center"/>
                                     <w:rPr>
                                       <w:rFonts w:ascii="Times New Roman"/>
                                       <w:sz w:val="18"/>
                                       <w:szCs w:val="18"/>
                                     </w:rPr>
                                   </w:pPr>
+                                  <w:r>
+                                    <w:rPr>
+                                      <w:rFonts w:ascii="Arial" w:hAnsi="Arial" w:cs="Arial"/>
+                                      <w:sz w:val="18"/>
+                                      <w:szCs w:val="18"/>
+                                      <w:color w:val="000000"/>
+                                    </w:rPr>
+                                    <w:t xml:space="preserve">{{ photo_logo }}</w:t>
+                                  </w:r>
                                 </w:p>
                               </w:tc>
                               <w:tc>
@@ -14113,27 +14123,6 @@
                           <a:xfrm>
                             <a:off x="0" y="9142"/>
                             <a:ext cx="7560564" cy="10683241"/>
-                          </a:xfrm>
-                          <a:prstGeom prst="rect">
-                            <a:avLst/>
-                          </a:prstGeom>
-                        </pic:spPr>
-                      </pic:pic>
-                      <pic:pic xmlns:pic="http://schemas.openxmlformats.org/drawingml/2006/picture">
-                        <pic:nvPicPr>
-                          <pic:cNvPr id="9" name="Image 9" descr="Future New Logo"/>
-                          <pic:cNvPicPr/>
-                        </pic:nvPicPr>
-                        <pic:blipFill>
-                          <a:blip r:embed="rId6" cstate="print"/>
-                          <a:stretch>
-                            <a:fillRect/>
-                          </a:stretch>
-                        </pic:blipFill>
-                        <pic:spPr>
-                          <a:xfrm>
-                            <a:off x="784859" y="0"/>
-                            <a:ext cx="4628388" cy="2409443"/>
                           </a:xfrm>
                           <a:prstGeom prst="rect">
                             <a:avLst/>
@@ -14254,9 +14243,6 @@
                 </v:shape>
                 <v:shape id="Image 8" o:spid="_x0000_s1028" type="#_x0000_t75" alt="Sans titre-7" style="position:absolute;top:91;width:75605;height:106832;visibility:visible;mso-wrap-style:square" o:gfxdata="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">
                   <v:imagedata r:id="rId12" o:title="Sans titre-7"/>
-                </v:shape>
-                <v:shape id="Image 9" o:spid="_x0000_s1029" type="#_x0000_t75" alt="Future New Logo" style="position:absolute;left:7848;width:46284;height:24094;visibility:visible;mso-wrap-style:square" o:gfxdata="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">
-                  <v:imagedata r:id="rId13" o:title="Future New Logo"/>
                 </v:shape>
                 <v:shape id="Graphic 10" o:spid="_x0000_s1030" style="position:absolute;left:1729;top:105163;width:72295;height:13;visibility:visible;mso-wrap-style:square;v-text-anchor:top" coordsize="7229475,1270" o:gfxdata="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" path="m,l7229475,e" filled="f" strokecolor="#ec7c30" strokeweight="1.56pt">
                   <v:path arrowok="t"/>

</xml_diff>

<commit_message>
Fix passport attachment on page 2: prevent overflow and ensure real passport image inclusion
</commit_message>
<xml_diff>
--- a/template/cv_template.docx
+++ b/template/cv_template.docx
@@ -14262,7 +14262,7 @@
     </w:p>
     <w:p>
       <w:pPr>
-        <w:spacing w:before="0" w:after="160"/>
+        <w:spacing w:before="0" w:after="80"/>
         <w:jc w:val="center"/>
         <w:rPr>
           <w:rFonts w:ascii="Times New Roman"/>
@@ -14274,8 +14274,8 @@
       <w:r>
         <w:rPr>
           <w:rFonts w:ascii="Arial" w:hAnsi="Arial" w:cs="Arial"/>
-          <w:sz w:val="16"/>
-          <w:szCs w:val="16"/>
+          <w:sz w:val="14"/>
+          <w:szCs w:val="14"/>
           <w:color w:val="000000"/>
         </w:rPr>
         <w:t xml:space="preserve">{% if photo_passport %}</w:t>
@@ -14284,8 +14284,8 @@
         <w:rPr>
           <w:rFonts w:ascii="Arial" w:hAnsi="Arial" w:cs="Arial"/>
           <w:b/>
-          <w:sz w:val="28"/>
-          <w:szCs w:val="28"/>
+          <w:sz w:val="20"/>
+          <w:szCs w:val="20"/>
           <w:color w:val="1B365D"/>
         </w:rPr>
         <w:t xml:space="preserve">PASSPORT
@@ -14294,8 +14294,8 @@
       <w:r>
         <w:rPr>
           <w:rFonts w:ascii="Arial" w:hAnsi="Arial" w:cs="Arial"/>
-          <w:sz w:val="20"/>
-          <w:szCs w:val="20"/>
+          <w:sz w:val="16"/>
+          <w:szCs w:val="16"/>
           <w:color w:val="000000"/>
         </w:rPr>
         <w:t xml:space="preserve">{{ photo_passport }}</w:t>
@@ -14303,8 +14303,8 @@
       <w:r>
         <w:rPr>
           <w:rFonts w:ascii="Arial" w:hAnsi="Arial" w:cs="Arial"/>
-          <w:sz w:val="16"/>
-          <w:szCs w:val="16"/>
+          <w:sz w:val="14"/>
+          <w:szCs w:val="14"/>
           <w:color w:val="000000"/>
         </w:rPr>
         <w:t xml:space="preserve">{% endif %}</w:t>

</xml_diff>

<commit_message>
Make full-body photo fill container with smart cover-crop and extended row 29 merge
</commit_message>
<xml_diff>
--- a/template/cv_template.docx
+++ b/template/cv_template.docx
@@ -559,13 +559,13 @@
                                 <w:p>
                                   <w:pPr>
                                     <w:pStyle w:val="TableParagraph"/>
-                                    <w:spacing w:before="48"/>
                                     <w:jc w:val="center"/>
                                     <w:rPr>
                                       <w:rFonts w:ascii="Times New Roman"/>
                                       <w:sz w:val="18"/>
                                       <w:szCs w:val="18"/>
                                     </w:rPr>
+                                    <w:spacing w:before="0" w:after="0" w:line="240" w:lineRule="auto"/>
                                   </w:pPr>
                                   <w:r>
                                     <w:rPr>
@@ -576,17 +576,6 @@
                                     </w:rPr>
                                     <w:t xml:space="preserve">{{ photo_full }}</w:t>
                                   </w:r>
-                                </w:p>
-                                <w:p>
-                                  <w:pPr>
-                                    <w:pStyle w:val="TableParagraph"/>
-                                    <w:ind w:left="-7" w:right="-44"/>
-                                    <w:rPr>
-                                      <w:rFonts w:ascii="Times New Roman"/>
-                                      <w:sz w:val="18"/>
-                                      <w:szCs w:val="18"/>
-                                    </w:rPr>
-                                  </w:pPr>
                                 </w:p>
                               </w:tc>
                               <w:tc>
@@ -4832,6 +4821,7 @@
                                 <w:tcPr>
                                   <w:tcW w:w="5073" w:type="dxa"/>
                                   <w:gridSpan w:val="4"/>
+                                  <w:vMerge/>
                                 </w:tcPr>
                                 <w:p>
                                   <w:pPr>

</xml_diff>

<commit_message>
Fix: auto-trim whitespace + zero cell margins so photos fit holder perfectly
</commit_message>
<xml_diff>
--- a/template/cv_template.docx
+++ b/template/cv_template.docx
@@ -177,11 +177,17 @@
                                 <w:tcPr>
                                   <w:tcW w:w="1999" w:type="dxa"/>
                                   <w:gridSpan w:val="2"/>
+                                  <w:tcMar>
+                                    <w:top w:w="0" w:type="dxa"/>
+                                    <w:left w:w="0" w:type="dxa"/>
+                                    <w:bottom w:w="0" w:type="dxa"/>
+                                    <w:right w:w="0" w:type="dxa"/>
+                                  </w:tcMar>
+                                  <w:vAlign w:val="center"/>
                                 </w:tcPr>
                                 <w:p>
                                   <w:pPr>
                                     <w:pStyle w:val="TableParagraph"/>
-                                    <w:ind w:left="-1" w:right="-15"/>
                                     <w:jc w:val="center"/>
                                     <w:rPr>
                                       <w:rFonts w:ascii="Times New Roman"/>
@@ -556,6 +562,13 @@
                                   <w:tcW w:w="5073" w:type="dxa"/>
                                   <w:gridSpan w:val="4"/>
                                   <w:vMerge w:val="restart"/>
+                                  <w:tcMar>
+                                    <w:top w:w="0" w:type="dxa"/>
+                                    <w:left w:w="0" w:type="dxa"/>
+                                    <w:bottom w:w="0" w:type="dxa"/>
+                                    <w:right w:w="0" w:type="dxa"/>
+                                  </w:tcMar>
+                                  <w:vAlign w:val="center"/>
                                 </w:tcPr>
                                 <w:p>
                                   <w:pPr>

</xml_diff>